<commit_message>
docs: add music production further experience
Include Berlin-based music production since 2000 with Knaller Soundsystem
Instagram link and selected artist credits.

Co-authored-by: Cursor <cursoragent@cursor.com>
</commit_message>
<xml_diff>
--- a/src/David_Zaddach_CV_EN_2026.docx
+++ b/src/David_Zaddach_CV_EN_2026.docx
@@ -1311,6 +1311,33 @@
           <w:sz w:val="21"/>
         </w:rPr>
         <w:t>Further experience</w:t>
+      </w:r>
+    </w:p>
+    <w:p>
+      <w:pPr>
+        <w:pStyle w:val="ListBullet"/>
+      </w:pPr>
+      <w:r>
+        <w:t xml:space="preserve">Ongoing music production; selected artists and projects include </w:t>
+      </w:r>
+      <w:hyperlink r:id="rId8">
+        <w:r>
+          <w:rPr>
+            <w:color w:val="0563C1"/>
+            <w:u w:val="single"/>
+          </w:rPr>
+          <w:t>Knaller Soundsystem</w:t>
+        </w:r>
+      </w:hyperlink>
+      <w:r>
+        <w:t>, David Main, Mic Profz, Lucry, PA Sports, among others.</w:t>
+      </w:r>
+    </w:p>
+    <w:p>
+      <w:r>
+        <w:t>Music production, Berlin</w:t>
+        <w:tab/>
+        <w:t>2000 – present</w:t>
       </w:r>
     </w:p>
     <w:p>

</xml_diff>

<commit_message>
docs: refine CV profile, skills and formatting
Humanize the profile text, lead with enterprise technology, expand skills
with AI and UX topics, add artist links, and replace long dashes in copy.

Co-authored-by: Cursor <cursoragent@cursor.com>
</commit_message>
<xml_diff>
--- a/src/David_Zaddach_CV_EN_2026.docx
+++ b/src/David_Zaddach_CV_EN_2026.docx
@@ -126,11 +126,7 @@
         <w:spacing w:after="120"/>
       </w:pPr>
       <w:r>
-        <w:t xml:space="preserve">Senior product and technology leader with deep expertise in digital music, licensing, content management, copyright and enterprise platforms. Drives multi-year portfolio and investment logic, P&amp;L-aligned governance and a scalable operating model in complex B2B environments—leading cross-functional teams, partner and vendor ecosystems, and disciplined delivery from executive narrative to measurable </w:t>
-      </w:r>
-      <w:proofErr w:type="spellStart"/>
-      <w:r>
-        <w:t>outcomes.</w:t>
+        <w:t>I work in enterprise technology and digital music. I started in hands-on content and technical operations and moved into senior product leadership. Today I lead technology products at BMG: shaping the portfolio, aligning business and engineering, working with partners and vendors, and keeping delivery focused on outcomes that matter.</w:t>
       </w:r>
     </w:p>
     <w:p>
@@ -168,15 +164,7 @@
         <w:pStyle w:val="ListBullet"/>
       </w:pPr>
       <w:r>
-        <w:t xml:space="preserve">Portfolio strategy, </w:t>
-      </w:r>
-      <w:proofErr w:type="spellStart"/>
-      <w:r>
-        <w:t>prioritisation</w:t>
-      </w:r>
-      <w:proofErr w:type="spellEnd"/>
-      <w:r>
-        <w:t xml:space="preserve"> &amp; multi-year roadmaps</w:t>
+        <w:t>AI strategy and applied expertise (LLMs, agentic systems, human-in-the-loop)</w:t>
       </w:r>
     </w:p>
     <w:p>
@@ -184,7 +172,7 @@
         <w:pStyle w:val="ListBullet"/>
       </w:pPr>
       <w:r>
-        <w:t>P&amp;L ownership, budgeting &amp; vendor / partner governance</w:t>
+        <w:t>Agentic coding and AI-assisted software delivery</w:t>
       </w:r>
     </w:p>
     <w:p>
@@ -192,7 +180,7 @@
         <w:pStyle w:val="ListBullet"/>
       </w:pPr>
       <w:r>
-        <w:t>B2B platform &amp; services scaling (music / copyright / data)</w:t>
+        <w:t>UI/UX design and product experience</w:t>
       </w:r>
     </w:p>
     <w:p>
@@ -200,7 +188,7 @@
         <w:pStyle w:val="ListBullet"/>
       </w:pPr>
       <w:r>
-        <w:t>Operating model design (cross-functional alignment, agile at scale)</w:t>
+        <w:t>Portfolio strategy, prioritisation &amp; multi-year roadmaps</w:t>
       </w:r>
     </w:p>
     <w:p>
@@ -208,7 +196,7 @@
         <w:pStyle w:val="ListBullet"/>
       </w:pPr>
       <w:r>
-        <w:t>Stakeholder &amp; board-level communication</w:t>
+        <w:t>P&amp;L ownership, budgeting &amp; vendor / partner governance</w:t>
       </w:r>
     </w:p>
     <w:p>
@@ -216,7 +204,7 @@
         <w:pStyle w:val="ListBullet"/>
       </w:pPr>
       <w:r>
-        <w:t>Domain depth: music publishing, licensing &amp; copyright operations</w:t>
+        <w:t>B2B platform &amp; services scaling (music / copyright / data)</w:t>
       </w:r>
     </w:p>
     <w:p>
@@ -224,37 +212,48 @@
         <w:pStyle w:val="ListBullet"/>
       </w:pPr>
       <w:r>
-        <w:t>Data-driven performance management &amp; KPI systems</w:t>
+        <w:t>Operating model design (cross-functional alignment, agile at scale)</w:t>
       </w:r>
     </w:p>
     <w:p>
       <w:pPr>
         <w:pStyle w:val="ListBullet"/>
-        <w:rPr>
-          <w:rStyle w:val="Emphasis"/>
-          <w:i w:val="0"/>
-          <w:iCs w:val="0"/>
-        </w:rPr>
-      </w:pPr>
-      <w:r>
-        <w:rPr>
-          <w:rStyle w:val="Emphasis"/>
-          <w:rFonts w:cs="Arial"/>
-          <w:color w:val="222222"/>
-          <w:szCs w:val="20"/>
-        </w:rPr>
-        <w:t>Hands-on product depth where needed (content, digital delivery, technical operations)</w:t>
+      </w:pPr>
+      <w:r>
+        <w:t>Stakeholder &amp; board-level communication</w:t>
       </w:r>
     </w:p>
     <w:p>
       <w:pPr>
         <w:pStyle w:val="ListBullet"/>
-        <w:numPr>
-          <w:ilvl w:val="0"/>
-          <w:numId w:val="0"/>
-        </w:numPr>
-        <w:ind w:left="360"/>
-      </w:pPr>
+      </w:pPr>
+      <w:r>
+        <w:t>Domain depth: music publishing, licensing &amp; copyright operations</w:t>
+      </w:r>
+    </w:p>
+    <w:p>
+      <w:pPr>
+        <w:pStyle w:val="ListBullet"/>
+      </w:pPr>
+      <w:r>
+        <w:t>Data-driven performance management &amp; KPI systems</w:t>
+      </w:r>
+    </w:p>
+    <w:p>
+      <w:pPr>
+        <w:pStyle w:val="ListBullet"/>
+      </w:pPr>
+      <w:r>
+        <w:t>Digital transformation, platform thinking &amp; innovation</w:t>
+      </w:r>
+    </w:p>
+    <w:p>
+      <w:pPr>
+        <w:pStyle w:val="ListBullet"/>
+      </w:pPr>
+      <w:r>
+        <w:t>Hands-on product depth where needed (content, digital delivery, technical operations)</w:t>
+      </w:r>
     </w:p>
     <w:p>
       <w:pPr>
@@ -278,14 +277,7 @@
         </w:rPr>
       </w:pPr>
       <w:r>
-        <w:rPr>
-          <w:b/>
-          <w:i/>
-          <w:iCs/>
-          <w:color w:val="303030"/>
-          <w:sz w:val="21"/>
-        </w:rPr>
-        <w:t>BMG – The New Music Company, Berlin</w:t>
+        <w:t>BMG, The New Music Company, Berlin</w:t>
       </w:r>
     </w:p>
     <w:p>
@@ -296,21 +288,9 @@
         <w:spacing w:before="40" w:after="0"/>
       </w:pPr>
       <w:r>
-        <w:rPr>
-          <w:b/>
-        </w:rPr>
         <w:t>Senior Director Technology Products, Head of Product</w:t>
-      </w:r>
-      <w:r>
         <w:tab/>
-      </w:r>
-      <w:r>
-        <w:rPr>
-          <w:i/>
-          <w:color w:val="5F5A52"/>
-          <w:sz w:val="18"/>
-        </w:rPr>
-        <w:t>July 2023 – present</w:t>
+        <w:t>July 2023 to present</w:t>
       </w:r>
     </w:p>
     <w:p>
@@ -351,29 +331,7 @@
         <w:pStyle w:val="ListBullet"/>
       </w:pPr>
       <w:r>
-        <w:rPr>
-          <w:rStyle w:val="font-semibold"/>
-          <w:rFonts w:cs="Arial"/>
-          <w:b/>
-          <w:bCs/>
-          <w:color w:val="222222"/>
-          <w:szCs w:val="20"/>
-        </w:rPr>
-        <w:t>Orchestrates</w:t>
-      </w:r>
-      <w:r>
-        <w:t> collaboration across business units, engineering, partners → </w:t>
-      </w:r>
-      <w:r>
-        <w:rPr>
-          <w:rStyle w:val="font-semibold"/>
-          <w:rFonts w:cs="Arial"/>
-          <w:b/>
-          <w:bCs/>
-          <w:color w:val="222222"/>
-          <w:szCs w:val="20"/>
-        </w:rPr>
-        <w:t>scaled delivery</w:t>
+        <w:t>Brings business units, engineering and partners together to deliver at scale</w:t>
       </w:r>
     </w:p>
     <w:p>
@@ -467,22 +425,9 @@
         <w:spacing w:before="40" w:after="0"/>
       </w:pPr>
       <w:r>
-        <w:rPr>
-          <w:b/>
-        </w:rPr>
-        <w:lastRenderedPageBreak/>
         <w:t>Director Business Services</w:t>
-      </w:r>
-      <w:r>
         <w:tab/>
-      </w:r>
-      <w:r>
-        <w:rPr>
-          <w:i/>
-          <w:color w:val="5F5A52"/>
-          <w:sz w:val="18"/>
-        </w:rPr>
-        <w:t>Jan. 2023 – July 2023</w:t>
+        <w:t>Jan. 2023 to July 2023</w:t>
       </w:r>
     </w:p>
     <w:p>
@@ -518,21 +463,9 @@
         <w:spacing w:before="40" w:after="0"/>
       </w:pPr>
       <w:r>
-        <w:rPr>
-          <w:b/>
-        </w:rPr>
         <w:t>Senior Product Owner Business Services</w:t>
-      </w:r>
-      <w:r>
         <w:tab/>
-      </w:r>
-      <w:r>
-        <w:rPr>
-          <w:i/>
-          <w:color w:val="5F5A52"/>
-          <w:sz w:val="18"/>
-        </w:rPr>
-        <w:t>May 2022 – Dec. 2022</w:t>
+        <w:t>May 2022 to Dec. 2022</w:t>
       </w:r>
     </w:p>
     <w:p>
@@ -587,21 +520,9 @@
         <w:spacing w:before="40" w:after="0"/>
       </w:pPr>
       <w:r>
-        <w:rPr>
-          <w:b/>
-        </w:rPr>
         <w:t>Senior Product Owner</w:t>
-      </w:r>
-      <w:r>
         <w:tab/>
-      </w:r>
-      <w:r>
-        <w:rPr>
-          <w:i/>
-          <w:color w:val="5F5A52"/>
-          <w:sz w:val="18"/>
-        </w:rPr>
-        <w:t>May 2020 – April 2022</w:t>
+        <w:t>May 2020 to April 2022</w:t>
       </w:r>
     </w:p>
     <w:p>
@@ -667,21 +588,9 @@
         <w:spacing w:before="40" w:after="0"/>
       </w:pPr>
       <w:r>
-        <w:rPr>
-          <w:b/>
-        </w:rPr>
         <w:t>Product Owner</w:t>
-      </w:r>
-      <w:r>
         <w:tab/>
-      </w:r>
-      <w:r>
-        <w:rPr>
-          <w:i/>
-          <w:color w:val="5F5A52"/>
-          <w:sz w:val="18"/>
-        </w:rPr>
-        <w:t>Jan. 2018 – May 2020</w:t>
+        <w:t>Jan. 2018 to May 2020</w:t>
       </w:r>
     </w:p>
     <w:p>
@@ -717,21 +626,9 @@
         <w:spacing w:before="40" w:after="0"/>
       </w:pPr>
       <w:r>
-        <w:rPr>
-          <w:b/>
-        </w:rPr>
         <w:t>Business Analyst</w:t>
-      </w:r>
-      <w:r>
         <w:tab/>
-      </w:r>
-      <w:r>
-        <w:rPr>
-          <w:i/>
-          <w:color w:val="5F5A52"/>
-          <w:sz w:val="18"/>
-        </w:rPr>
-        <w:t>Oct. 2016 – Dec. 2017</w:t>
+        <w:t>Oct. 2016 to Dec. 2017</w:t>
       </w:r>
     </w:p>
     <w:p>
@@ -767,21 +664,9 @@
         <w:spacing w:before="40" w:after="0"/>
       </w:pPr>
       <w:r>
-        <w:rPr>
-          <w:b/>
-        </w:rPr>
         <w:t>Senior Product Manager (Online Operations)</w:t>
-      </w:r>
-      <w:r>
         <w:tab/>
-      </w:r>
-      <w:r>
-        <w:rPr>
-          <w:i/>
-          <w:color w:val="5F5A52"/>
-          <w:sz w:val="18"/>
-        </w:rPr>
-        <w:t>Oct. 2015 – Sept. 2016</w:t>
+        <w:t>Oct. 2015 to Sept. 2016</w:t>
       </w:r>
     </w:p>
     <w:p>
@@ -858,21 +743,9 @@
         <w:spacing w:before="40" w:after="0"/>
       </w:pPr>
       <w:r>
-        <w:rPr>
-          <w:b/>
-        </w:rPr>
         <w:t>Product Manager Mobile Products</w:t>
-      </w:r>
-      <w:r>
         <w:tab/>
-      </w:r>
-      <w:r>
-        <w:rPr>
-          <w:i/>
-          <w:color w:val="5F5A52"/>
-          <w:sz w:val="18"/>
-        </w:rPr>
-        <w:t>2014 – 2015</w:t>
+        <w:t>2014 to 2015</w:t>
       </w:r>
     </w:p>
     <w:p>
@@ -938,21 +811,9 @@
         <w:spacing w:before="40" w:after="0"/>
       </w:pPr>
       <w:r>
-        <w:rPr>
-          <w:b/>
-        </w:rPr>
         <w:t>Product Manager Content Services</w:t>
-      </w:r>
-      <w:r>
         <w:tab/>
-      </w:r>
-      <w:r>
-        <w:rPr>
-          <w:i/>
-          <w:color w:val="5F5A52"/>
-          <w:sz w:val="18"/>
-        </w:rPr>
-        <w:t>2013 – 2014</w:t>
+        <w:t>2013 to 2014</w:t>
       </w:r>
     </w:p>
     <w:p>
@@ -1018,21 +879,9 @@
         <w:spacing w:before="40" w:after="0"/>
       </w:pPr>
       <w:r>
-        <w:rPr>
-          <w:b/>
-        </w:rPr>
         <w:t>Technical Operations Manager &amp; Product Manager Music</w:t>
-      </w:r>
-      <w:r>
         <w:tab/>
-      </w:r>
-      <w:r>
-        <w:rPr>
-          <w:i/>
-          <w:color w:val="5F5A52"/>
-          <w:sz w:val="18"/>
-        </w:rPr>
-        <w:t>2012 – 2013</w:t>
+        <w:t>2012 to 2013</w:t>
       </w:r>
     </w:p>
     <w:p>
@@ -1098,21 +947,9 @@
         <w:spacing w:before="40" w:after="0"/>
       </w:pPr>
       <w:r>
-        <w:rPr>
-          <w:b/>
-        </w:rPr>
-        <w:t>Technical Operations Manager &amp; Team Lead – Content Ingestion</w:t>
-      </w:r>
-      <w:r>
+        <w:t>Technical Operations Manager &amp; Team Lead ,  Content Ingestion</w:t>
         <w:tab/>
-      </w:r>
-      <w:r>
-        <w:rPr>
-          <w:i/>
-          <w:color w:val="5F5A52"/>
-          <w:sz w:val="18"/>
-        </w:rPr>
-        <w:t>2011 – 2012</w:t>
+        <w:t>2011 to 2012</w:t>
       </w:r>
     </w:p>
     <w:p>
@@ -1168,21 +1005,9 @@
         <w:spacing w:before="40" w:after="0"/>
       </w:pPr>
       <w:r>
-        <w:rPr>
-          <w:b/>
-        </w:rPr>
         <w:t>Manager / Team Lead Audio Production &amp; Content Ingestion</w:t>
-      </w:r>
-      <w:r>
         <w:tab/>
-      </w:r>
-      <w:r>
-        <w:rPr>
-          <w:i/>
-          <w:color w:val="5F5A52"/>
-          <w:sz w:val="18"/>
-        </w:rPr>
-        <w:t>2010 – 2011</w:t>
+        <w:t>2010 to 2011</w:t>
       </w:r>
     </w:p>
     <w:p>
@@ -1238,21 +1063,9 @@
         <w:spacing w:before="40" w:after="0"/>
       </w:pPr>
       <w:r>
-        <w:rPr>
-          <w:b/>
-        </w:rPr>
         <w:t>Team Lead Audio Production &amp; Content Upload</w:t>
-      </w:r>
-      <w:r>
         <w:tab/>
-      </w:r>
-      <w:r>
-        <w:rPr>
-          <w:i/>
-          <w:color w:val="5F5A52"/>
-          <w:sz w:val="18"/>
-        </w:rPr>
-        <w:t>2008 – 2010</w:t>
+        <w:t>2008 to 2010</w:t>
       </w:r>
     </w:p>
     <w:p>
@@ -1330,14 +1143,26 @@
         </w:r>
       </w:hyperlink>
       <w:r>
-        <w:t>, David Main, Mic Profz, Lucry, PA Sports, among others.</w:t>
+        <w:t xml:space="preserve">, </w:t>
+      </w:r>
+      <w:hyperlink r:id="rId9">
+        <w:r>
+          <w:rPr>
+            <w:color w:val="0563C1"/>
+            <w:u w:val="single"/>
+          </w:rPr>
+          <w:t>David Main</w:t>
+        </w:r>
+      </w:hyperlink>
+      <w:r>
+        <w:t>, Mic Profz, Lucry, PA Sports, among others.</w:t>
       </w:r>
     </w:p>
     <w:p>
       <w:r>
         <w:t>Music production, Berlin</w:t>
         <w:tab/>
-        <w:t>2000 – present</w:t>
+        <w:t>2000 to present</w:t>
       </w:r>
     </w:p>
     <w:p>
@@ -1350,7 +1175,7 @@
       <w:r>
         <w:t>Universal Music, Berlin</w:t>
         <w:tab/>
-        <w:t>2007 – 2008</w:t>
+        <w:t>2007 to 2008</w:t>
       </w:r>
     </w:p>
     <w:p>
@@ -1369,20 +1194,8 @@
         <w:spacing w:before="40" w:after="0"/>
       </w:pPr>
       <w:r>
-        <w:rPr>
-          <w:b/>
-        </w:rPr>
-        <w:t>Studio for Electroacoustic Music – Academy of Arts, Berlin</w:t>
-      </w:r>
-      <w:r>
+        <w:t>Studio for Electroacoustic Music ,  Academy of Arts, Berlin</w:t>
         <w:tab/>
-      </w:r>
-      <w:r>
-        <w:rPr>
-          <w:i/>
-          <w:color w:val="5F5A52"/>
-          <w:sz w:val="18"/>
-        </w:rPr>
         <w:t>2006</w:t>
       </w:r>
     </w:p>
@@ -1402,38 +1215,8 @@
         <w:spacing w:before="40" w:after="0"/>
       </w:pPr>
       <w:r>
-        <w:rPr>
-          <w:b/>
-        </w:rPr>
-        <w:t xml:space="preserve">Short film "Wasser &amp; Papayas" – </w:t>
-      </w:r>
-      <w:r>
-        <w:rPr>
-          <w:bCs/>
-        </w:rPr>
-        <w:t>s</w:t>
-      </w:r>
-      <w:r>
-        <w:rPr>
-          <w:bCs/>
-        </w:rPr>
-        <w:t>ound</w:t>
-      </w:r>
-      <w:r>
-        <w:rPr>
-          <w:bCs/>
-        </w:rPr>
-        <w:t xml:space="preserve"> engineer</w:t>
-      </w:r>
-      <w:r>
+        <w:t>Short film "Wasser &amp; Papayas" ,  sound engineer</w:t>
         <w:tab/>
-      </w:r>
-      <w:r>
-        <w:rPr>
-          <w:i/>
-          <w:color w:val="5F5A52"/>
-          <w:sz w:val="18"/>
-        </w:rPr>
         <w:t>2006</w:t>
       </w:r>
     </w:p>
@@ -1453,33 +1236,9 @@
         <w:spacing w:before="40" w:after="0"/>
       </w:pPr>
       <w:r>
-        <w:rPr>
-          <w:b/>
-        </w:rPr>
-        <w:t xml:space="preserve">24-7 Records Germany – </w:t>
-      </w:r>
-      <w:r>
-        <w:rPr>
-          <w:bCs/>
-        </w:rPr>
-        <w:t>C</w:t>
-      </w:r>
-      <w:r>
-        <w:rPr>
-          <w:bCs/>
-        </w:rPr>
-        <w:t>o-founder</w:t>
-      </w:r>
-      <w:r>
+        <w:t>24-7 Records Germany ,  Co-founder</w:t>
         <w:tab/>
-      </w:r>
-      <w:r>
-        <w:rPr>
-          <w:i/>
-          <w:color w:val="5F5A52"/>
-          <w:sz w:val="18"/>
-        </w:rPr>
-        <w:t>2003 – 2005</w:t>
+        <w:t>2003 to 2005</w:t>
       </w:r>
     </w:p>
     <w:p>
@@ -1545,27 +1304,9 @@
         <w:spacing w:before="40" w:after="0"/>
       </w:pPr>
       <w:r>
-        <w:rPr>
-          <w:b/>
-        </w:rPr>
-        <w:t>DResearch Digital Media Systems GmbH –</w:t>
-      </w:r>
-      <w:r>
-        <w:rPr>
-          <w:bCs/>
-        </w:rPr>
-        <w:t xml:space="preserve"> assistant</w:t>
-      </w:r>
-      <w:r>
+        <w:t>DResearch Digital Media Systems GmbH ,  assistant</w:t>
         <w:tab/>
-      </w:r>
-      <w:r>
-        <w:rPr>
-          <w:i/>
-          <w:color w:val="5F5A52"/>
-          <w:sz w:val="18"/>
-        </w:rPr>
-        <w:t>1999 – 2001</w:t>
+        <w:t>1999 to 2001</w:t>
       </w:r>
     </w:p>
     <w:p>
@@ -1602,20 +1343,8 @@
         <w:spacing w:before="40" w:after="0"/>
       </w:pPr>
       <w:r>
-        <w:rPr>
-          <w:b/>
-        </w:rPr>
-        <w:t>Magister Artium – Technische Universität Berlin</w:t>
-      </w:r>
-      <w:r>
+        <w:t>Magister Artium ,  Technische Universität Berlin</w:t>
         <w:tab/>
-      </w:r>
-      <w:r>
-        <w:rPr>
-          <w:i/>
-          <w:color w:val="5F5A52"/>
-          <w:sz w:val="18"/>
-        </w:rPr>
         <w:t>Graduated 2007</w:t>
       </w:r>
     </w:p>
@@ -1696,7 +1425,7 @@
         <w:ind w:left="216"/>
       </w:pPr>
       <w:r>
-        <w:t>Major: musicology (2002 – 2007).</w:t>
+        <w:t>Major: musicology (2002 to 2007).</w:t>
       </w:r>
     </w:p>
     <w:p>
@@ -1722,21 +1451,9 @@
         <w:spacing w:before="40" w:after="0"/>
       </w:pPr>
       <w:r>
-        <w:rPr>
-          <w:b/>
-        </w:rPr>
-        <w:t>Abitur (university entrance diploma) – 4. Gymnasium Descartes, Berlin</w:t>
-      </w:r>
-      <w:r>
+        <w:t>Abitur (university entrance diploma) ,  4. Gymnasium Descartes, Berlin</w:t>
         <w:tab/>
-      </w:r>
-      <w:r>
-        <w:rPr>
-          <w:i/>
-          <w:color w:val="5F5A52"/>
-          <w:sz w:val="18"/>
-        </w:rPr>
-        <w:t>1994 – 2001</w:t>
+        <w:t>1994 to 2001</w:t>
       </w:r>
     </w:p>
     <w:p>

</xml_diff>

<commit_message>
docs: simplify senior product manager title at ICE
</commit_message>
<xml_diff>
--- a/src/David_Zaddach_CV_EN_2026.docx
+++ b/src/David_Zaddach_CV_EN_2026.docx
@@ -126,7 +126,7 @@
         <w:spacing w:after="120"/>
       </w:pPr>
       <w:r>
-        <w:t>I work in enterprise technology and digital music. I started in hands-on content and technical operations and moved into senior product leadership. Today I lead technology products at BMG: shaping the portfolio, aligning business and engineering, working with partners and vendors, and keeping delivery focused on outcomes that matter.</w:t>
+        <w:t>Senior product and technology leader in enterprise technology and digital music. Background in hands-on content and technical operations, with progression into senior product leadership. Leads technology products at BMG today: shaping the portfolio, aligning business and engineering, working with partners and vendors, and keeping delivery focused on outcomes that matter.</w:t>
       </w:r>
     </w:p>
     <w:p>
@@ -664,7 +664,7 @@
         <w:spacing w:before="40" w:after="0"/>
       </w:pPr>
       <w:r>
-        <w:t>Senior Product Manager (Online Operations)</w:t>
+        <w:t>Senior Product Manager</w:t>
         <w:tab/>
         <w:t>Oct. 2015 to Sept. 2016</w:t>
       </w:r>
@@ -1005,7 +1005,7 @@
         <w:spacing w:before="40" w:after="0"/>
       </w:pPr>
       <w:r>
-        <w:t>Manager / Team Lead Audio Production &amp; Content Ingestion</w:t>
+        <w:t>Team Lead Audio Production &amp; Content Ingestion</w:t>
         <w:tab/>
         <w:t>2010 to 2011</w:t>
       </w:r>

</xml_diff>

<commit_message>
feat: refresh CV for international executive positioning
Compress early career sections, sharpen outcome-driven bullets, remove personal details and Abitur, add target-role line, and sync web/ATS/PDF exports from a single HTML source.

Co-authored-by: Cursor <cursoragent@cursor.com>
</commit_message>
<xml_diff>
--- a/src/David_Zaddach_CV_EN_2026.docx
+++ b/src/David_Zaddach_CV_EN_2026.docx
@@ -89,35 +89,6 @@
           <w:color w:val="5F5226"/>
           <w:sz w:val="24"/>
         </w:rPr>
-        <w:t>Personal details</w:t>
-      </w:r>
-    </w:p>
-    <w:p>
-      <w:pPr>
-        <w:spacing w:after="120"/>
-      </w:pPr>
-      <w:r>
-        <w:t>Date of birth: 26 July 1981</w:t>
-      </w:r>
-      <w:r>
-        <w:br/>
-        <w:t>Nationality: German</w:t>
-      </w:r>
-      <w:r>
-        <w:br/>
-        <w:t>Marital status: married, two children</w:t>
-      </w:r>
-    </w:p>
-    <w:p>
-      <w:pPr>
-        <w:spacing w:before="280" w:after="120"/>
-      </w:pPr>
-      <w:r>
-        <w:rPr>
-          <w:b/>
-          <w:color w:val="5F5226"/>
-          <w:sz w:val="24"/>
-        </w:rPr>
         <w:t>Profile</w:t>
       </w:r>
     </w:p>
@@ -126,7 +97,12 @@
         <w:spacing w:after="120"/>
       </w:pPr>
       <w:r>
-        <w:t>Senior product and technology leader in enterprise technology and digital music. Background in hands-on content and technical operations, with progression into senior product leadership. Leads technology products at BMG today: shaping the portfolio, aligning business and engineering, working with partners and vendors, and keeping delivery focused on outcomes that matter.</w:t>
+        <w:t>Senior Director / Head of Product (Technology) | Enterprise platforms in music, copyright &amp; data</w:t>
+      </w:r>
+    </w:p>
+    <w:p>
+      <w:r>
+        <w:t>Target role: Chief Product Officer, VP Product or Head of Technology Products in music, media &amp; enterprise platforms</w:t>
       </w:r>
     </w:p>
     <w:p>
@@ -164,6 +140,46 @@
         <w:pStyle w:val="ListBullet"/>
       </w:pPr>
       <w:r>
+        <w:t>Portfolio strategy, prioritisation &amp; multi-year roadmaps</w:t>
+      </w:r>
+    </w:p>
+    <w:p>
+      <w:pPr>
+        <w:pStyle w:val="ListBullet"/>
+      </w:pPr>
+      <w:r>
+        <w:t>P&amp;L ownership, budgeting &amp; vendor governance</w:t>
+      </w:r>
+    </w:p>
+    <w:p>
+      <w:pPr>
+        <w:pStyle w:val="ListBullet"/>
+      </w:pPr>
+      <w:r>
+        <w:t>B2B platform scaling (music / copyright / data)</w:t>
+      </w:r>
+    </w:p>
+    <w:p>
+      <w:pPr>
+        <w:pStyle w:val="ListBullet"/>
+      </w:pPr>
+      <w:r>
+        <w:t>Stakeholder &amp; board-level communication</w:t>
+      </w:r>
+    </w:p>
+    <w:p>
+      <w:pPr>
+        <w:pStyle w:val="ListBullet"/>
+      </w:pPr>
+      <w:r>
+        <w:t>Music publishing, licensing &amp; copyright operations</w:t>
+      </w:r>
+    </w:p>
+    <w:p>
+      <w:pPr>
+        <w:pStyle w:val="ListBullet"/>
+      </w:pPr>
+      <w:r>
         <w:t>AI strategy and applied expertise (LLMs, agentic systems, human-in-the-loop)</w:t>
       </w:r>
     </w:p>
@@ -180,54 +196,6 @@
         <w:pStyle w:val="ListBullet"/>
       </w:pPr>
       <w:r>
-        <w:t>UI/UX design and product experience</w:t>
-      </w:r>
-    </w:p>
-    <w:p>
-      <w:pPr>
-        <w:pStyle w:val="ListBullet"/>
-      </w:pPr>
-      <w:r>
-        <w:t>Portfolio strategy, prioritisation &amp; multi-year roadmaps</w:t>
-      </w:r>
-    </w:p>
-    <w:p>
-      <w:pPr>
-        <w:pStyle w:val="ListBullet"/>
-      </w:pPr>
-      <w:r>
-        <w:t>P&amp;L ownership, budgeting &amp; vendor / partner governance</w:t>
-      </w:r>
-    </w:p>
-    <w:p>
-      <w:pPr>
-        <w:pStyle w:val="ListBullet"/>
-      </w:pPr>
-      <w:r>
-        <w:t>B2B platform &amp; services scaling (music / copyright / data)</w:t>
-      </w:r>
-    </w:p>
-    <w:p>
-      <w:pPr>
-        <w:pStyle w:val="ListBullet"/>
-      </w:pPr>
-      <w:r>
-        <w:t>Operating model design (cross-functional alignment, agile at scale)</w:t>
-      </w:r>
-    </w:p>
-    <w:p>
-      <w:pPr>
-        <w:pStyle w:val="ListBullet"/>
-      </w:pPr>
-      <w:r>
-        <w:t>Stakeholder &amp; board-level communication</w:t>
-      </w:r>
-    </w:p>
-    <w:p>
-      <w:pPr>
-        <w:pStyle w:val="ListBullet"/>
-      </w:pPr>
-      <w:r>
         <w:t>Domain depth: music publishing, licensing &amp; copyright operations</w:t>
       </w:r>
     </w:p>
@@ -236,23 +204,7 @@
         <w:pStyle w:val="ListBullet"/>
       </w:pPr>
       <w:r>
-        <w:t>Data-driven performance management &amp; KPI systems</w:t>
-      </w:r>
-    </w:p>
-    <w:p>
-      <w:pPr>
-        <w:pStyle w:val="ListBullet"/>
-      </w:pPr>
-      <w:r>
         <w:t>Digital transformation, platform thinking &amp; innovation</w:t>
-      </w:r>
-    </w:p>
-    <w:p>
-      <w:pPr>
-        <w:pStyle w:val="ListBullet"/>
-      </w:pPr>
-      <w:r>
-        <w:t>Hands-on product depth where needed (content, digital delivery, technical operations)</w:t>
       </w:r>
     </w:p>
     <w:p>
@@ -270,18 +222,6 @@
     </w:p>
     <w:p>
       <w:pPr>
-        <w:spacing w:before="160" w:after="40"/>
-        <w:rPr>
-          <w:i/>
-          <w:iCs/>
-        </w:rPr>
-      </w:pPr>
-      <w:r>
-        <w:t>BMG, The New Music Company, Berlin</w:t>
-      </w:r>
-    </w:p>
-    <w:p>
-      <w:pPr>
         <w:tabs>
           <w:tab w:val="right" w:pos="9000"/>
         </w:tabs>
@@ -298,32 +238,7 @@
         <w:pStyle w:val="ListBullet"/>
       </w:pPr>
       <w:r>
-        <w:t>End-to-end ownership of the </w:t>
-      </w:r>
-      <w:r>
-        <w:rPr>
-          <w:rStyle w:val="font-semibold"/>
-          <w:rFonts w:cs="Arial"/>
-          <w:b/>
-          <w:bCs/>
-          <w:color w:val="222222"/>
-          <w:szCs w:val="20"/>
-        </w:rPr>
-        <w:t>technology product portfolio</w:t>
-      </w:r>
-      <w:r>
-        <w:t> + investment/roadmap + measurable value vs </w:t>
-      </w:r>
-      <w:r>
-        <w:rPr>
-          <w:rStyle w:val="font-semibold"/>
-          <w:rFonts w:cs="Arial"/>
-          <w:b/>
-          <w:bCs/>
-          <w:color w:val="222222"/>
-          <w:szCs w:val="20"/>
-        </w:rPr>
-        <w:t>enterprise priorities</w:t>
+        <w:t>Lead 15 product owners (internal and external), 10 vendor partners and 150+ developers; align business units and engineering to deliver at scale</w:t>
       </w:r>
     </w:p>
     <w:p>
@@ -331,7 +246,7 @@
         <w:pStyle w:val="ListBullet"/>
       </w:pPr>
       <w:r>
-        <w:t>Brings business units, engineering and partners together to deliver at scale</w:t>
+        <w:t>Led decommissioning of legacy monolithic copyright and royalties platform (iMaestro); delivered sync pitching tool, microservices, headless architecture and APIs for AI transformation</w:t>
       </w:r>
     </w:p>
     <w:p>
@@ -339,82 +254,7 @@
         <w:pStyle w:val="ListBullet"/>
       </w:pPr>
       <w:r>
-        <w:rPr>
-          <w:rStyle w:val="font-semibold"/>
-          <w:rFonts w:cs="Arial"/>
-          <w:b/>
-          <w:bCs/>
-          <w:color w:val="222222"/>
-          <w:szCs w:val="20"/>
-        </w:rPr>
-        <w:t>Shapes and governs</w:t>
-      </w:r>
-      <w:r>
-        <w:t> partner/vendor ecosystem: selection, governance, </w:t>
-      </w:r>
-      <w:r>
-        <w:rPr>
-          <w:rStyle w:val="font-semibold"/>
-          <w:rFonts w:cs="Arial"/>
-          <w:b/>
-          <w:bCs/>
-          <w:color w:val="222222"/>
-          <w:szCs w:val="20"/>
-        </w:rPr>
-        <w:t>performance and risk</w:t>
-      </w:r>
-      <w:r>
-        <w:t> vs commercial/technical goals</w:t>
-      </w:r>
-    </w:p>
-    <w:p>
-      <w:pPr>
-        <w:pStyle w:val="ListBullet"/>
-      </w:pPr>
-      <w:r>
-        <w:rPr>
-          <w:rStyle w:val="font-semibold"/>
-          <w:rFonts w:cs="Arial"/>
-          <w:b/>
-          <w:bCs/>
-          <w:color w:val="222222"/>
-          <w:szCs w:val="20"/>
-        </w:rPr>
-        <w:t>Full-cycle</w:t>
-      </w:r>
-      <w:r>
-        <w:t xml:space="preserve"> budget and resource accountability (planning, </w:t>
-      </w:r>
-      <w:proofErr w:type="spellStart"/>
-      <w:r>
-        <w:t>prioritisation</w:t>
-      </w:r>
-      <w:proofErr w:type="spellEnd"/>
-      <w:r>
-        <w:t xml:space="preserve">, </w:t>
-      </w:r>
-      <w:r>
-        <w:t>a</w:t>
-      </w:r>
-      <w:r>
-        <w:t>pprovals,</w:t>
-      </w:r>
-      <w:r>
-        <w:t xml:space="preserve"> </w:t>
-      </w:r>
-      <w:r>
-        <w:rPr>
-          <w:rStyle w:val="font-semibold"/>
-          <w:rFonts w:cs="Arial"/>
-          <w:b/>
-          <w:bCs/>
-          <w:color w:val="222222"/>
-          <w:szCs w:val="20"/>
-        </w:rPr>
-        <w:t>forecasting</w:t>
-      </w:r>
-      <w:r>
-        <w:t>, in-year control)</w:t>
+        <w:t>Full-cycle budget and vendor governance: selection, performance, risk, planning, prioritisation, approvals, forecasting and in-year control</w:t>
       </w:r>
     </w:p>
     <w:p>
@@ -437,7 +277,7 @@
         <w:ind w:left="216"/>
       </w:pPr>
       <w:r>
-        <w:t>Leadership and evolution of business services products and processes.</w:t>
+        <w:t>Drove evolution of business services products and operating processes; improved service delivery and operational readiness across the unit</w:t>
       </w:r>
     </w:p>
     <w:p>
@@ -447,7 +287,7 @@
         <w:ind w:left="216"/>
       </w:pPr>
       <w:r>
-        <w:t>Interface between operations, product and stakeholders.</w:t>
+        <w:t>Aligned operations, product and business stakeholders on priorities and roadmap; reduced handoff friction and kept cross-functional delivery on track</w:t>
       </w:r>
     </w:p>
     <w:p>
@@ -475,7 +315,7 @@
         <w:ind w:left="216"/>
       </w:pPr>
       <w:r>
-        <w:t>Product ownership: requirements, backlog and prioritisation.</w:t>
+        <w:t>Owned business services backlog and priorities; translated requirements into a focused roadmap aligned with business outcomes</w:t>
       </w:r>
     </w:p>
     <w:p>
@@ -485,7 +325,7 @@
         <w:ind w:left="216"/>
       </w:pPr>
       <w:r>
-        <w:t>Close collaboration with engineering and business teams.</w:t>
+        <w:t>Partnered with engineering and business teams to clarify scope, unblock delivery and maintain predictable release cadence</w:t>
       </w:r>
     </w:p>
     <w:p>
@@ -528,165 +368,64 @@
     <w:p>
       <w:pPr>
         <w:pStyle w:val="ListBullet"/>
-        <w:spacing w:after="40"/>
-        <w:ind w:left="216"/>
       </w:pPr>
       <w:r>
-        <w:t>Product owner for all online processing systems and two Scrum teams.</w:t>
+        <w:t>Owned outcomes for all online processing systems and two Scrum teams; delivered roadmap priorities for ICE's licensing back office serving collecting societies and publishers</w:t>
       </w:r>
     </w:p>
     <w:p>
       <w:pPr>
         <w:pStyle w:val="ListBullet"/>
-        <w:spacing w:after="40"/>
-        <w:ind w:left="216"/>
       </w:pPr>
       <w:r>
-        <w:t>Built and maintained the product roadmap and product backlog.</w:t>
+        <w:t>Aligned business, IT, customer and shareholder stakeholders on backlog and releases; kept cross-functional delivery predictable at platform scale</w:t>
       </w:r>
     </w:p>
     <w:p>
       <w:pPr>
         <w:pStyle w:val="ListBullet"/>
-        <w:spacing w:after="40"/>
-        <w:ind w:left="216"/>
       </w:pPr>
       <w:r>
-        <w:t>End-to-end view of ICE as the online licensing back office for collecting societies and publishers.</w:t>
+        <w:t>Drove online operations coordination including dispute management; improved reliability and throughput of high-volume copyright and licensing workflows</w:t>
       </w:r>
     </w:p>
     <w:p>
       <w:pPr>
         <w:pStyle w:val="ListBullet"/>
-        <w:spacing w:after="40"/>
-        <w:ind w:left="216"/>
       </w:pPr>
       <w:r>
-        <w:t>Stakeholder collaboration (business, IT, customers, shareholders).</w:t>
+        <w:t>Translated operational and regulatory requirements into backlog priorities; sustained continuous delivery across the online processing portfolio</w:t>
       </w:r>
     </w:p>
     <w:p>
-      <w:pPr>
-        <w:pStyle w:val="ListBullet"/>
-        <w:spacing w:after="40"/>
-        <w:ind w:left="216"/>
-      </w:pPr>
       <w:r>
-        <w:t>Coordination in online operations, including dispute management.</w:t>
+        <w:t>Earlier roles: product management and business analysis</w:t>
+        <w:tab/>
+        <w:t>2015 to 2020</w:t>
       </w:r>
     </w:p>
     <w:p>
       <w:pPr>
-        <w:spacing w:after="80"/>
-      </w:pPr>
-    </w:p>
-    <w:p>
-      <w:pPr>
-        <w:tabs>
-          <w:tab w:val="right" w:pos="9000"/>
-        </w:tabs>
-        <w:spacing w:before="40" w:after="0"/>
+        <w:pStyle w:val="ListBullet"/>
       </w:pPr>
       <w:r>
-        <w:t>Product Owner</w:t>
-        <w:tab/>
-        <w:t>Jan. 2018 to May 2020</w:t>
+        <w:t>Progressed from senior product manager and business analyst to product owner for ICE's online copyright and licensing platform.</w:t>
       </w:r>
     </w:p>
     <w:p>
       <w:pPr>
         <w:pStyle w:val="ListBullet"/>
-        <w:spacing w:after="40"/>
-        <w:ind w:left="216"/>
       </w:pPr>
       <w:r>
-        <w:t>Requirements, prioritisation and close collaboration with development teams.</w:t>
+        <w:t>Owned requirements, specifications and backlog prioritisation for online processing systems and platform development.</w:t>
       </w:r>
     </w:p>
     <w:p>
       <w:pPr>
         <w:pStyle w:val="ListBullet"/>
-        <w:spacing w:after="40"/>
-        <w:ind w:left="216"/>
       </w:pPr>
       <w:r>
-        <w:t>Continuous delivery within the product remit.</w:t>
-      </w:r>
-    </w:p>
-    <w:p>
-      <w:pPr>
-        <w:spacing w:after="80"/>
-      </w:pPr>
-    </w:p>
-    <w:p>
-      <w:pPr>
-        <w:tabs>
-          <w:tab w:val="right" w:pos="9000"/>
-        </w:tabs>
-        <w:spacing w:before="40" w:after="0"/>
-      </w:pPr>
-      <w:r>
-        <w:t>Business Analyst</w:t>
-        <w:tab/>
-        <w:t>Oct. 2016 to Dec. 2017</w:t>
-      </w:r>
-    </w:p>
-    <w:p>
-      <w:pPr>
-        <w:pStyle w:val="ListBullet"/>
-        <w:spacing w:after="40"/>
-        <w:ind w:left="216"/>
-      </w:pPr>
-      <w:r>
-        <w:t>Analysis and specification for product and platform development.</w:t>
-      </w:r>
-    </w:p>
-    <w:p>
-      <w:pPr>
-        <w:pStyle w:val="ListBullet"/>
-        <w:spacing w:after="40"/>
-        <w:ind w:left="216"/>
-      </w:pPr>
-      <w:r>
-        <w:t>Supporting teams on feasibility and functional clarity.</w:t>
-      </w:r>
-    </w:p>
-    <w:p>
-      <w:pPr>
-        <w:spacing w:after="80"/>
-      </w:pPr>
-    </w:p>
-    <w:p>
-      <w:pPr>
-        <w:tabs>
-          <w:tab w:val="right" w:pos="9000"/>
-        </w:tabs>
-        <w:spacing w:before="40" w:after="0"/>
-      </w:pPr>
-      <w:r>
-        <w:t>Senior Product Manager</w:t>
-        <w:tab/>
-        <w:t>Oct. 2015 to Sept. 2016</w:t>
-      </w:r>
-    </w:p>
-    <w:p>
-      <w:pPr>
-        <w:pStyle w:val="ListBullet"/>
-        <w:spacing w:after="40"/>
-        <w:ind w:left="216"/>
-      </w:pPr>
-      <w:r>
-        <w:t>Product management with a focus on online operations.</w:t>
-      </w:r>
-    </w:p>
-    <w:p>
-      <w:pPr>
-        <w:pStyle w:val="ListBullet"/>
-        <w:spacing w:after="40"/>
-        <w:ind w:left="216"/>
-      </w:pPr>
-      <w:r>
-        <w:t>Alignment of features and releases with business goals.</w:t>
+        <w:t>Partnered with engineering on continuous delivery and aligned releases with business and operational goals.</w:t>
       </w:r>
     </w:p>
     <w:p>
@@ -736,382 +475,35 @@
       </w:r>
     </w:p>
     <w:p>
-      <w:pPr>
-        <w:tabs>
-          <w:tab w:val="right" w:pos="9000"/>
-        </w:tabs>
-        <w:spacing w:before="40" w:after="0"/>
-      </w:pPr>
       <w:r>
-        <w:t>Product Manager Mobile Products</w:t>
+        <w:t>Earlier career: product, content operations and team leadership</w:t>
         <w:tab/>
-        <w:t>2014 to 2015</w:t>
+        <w:t>2008 to 2015</w:t>
       </w:r>
     </w:p>
     <w:p>
       <w:pPr>
         <w:pStyle w:val="ListBullet"/>
-        <w:spacing w:after="40"/>
-        <w:ind w:left="216"/>
       </w:pPr>
       <w:r>
-        <w:t>Coordinated product launches with music and games partners.</w:t>
+        <w:t>Progressed from team lead for audio production and content ingestion to product manager for mobile products and content services.</w:t>
       </w:r>
     </w:p>
     <w:p>
       <w:pPr>
         <w:pStyle w:val="ListBullet"/>
-        <w:spacing w:after="40"/>
-        <w:ind w:left="216"/>
       </w:pPr>
       <w:r>
-        <w:t>Stakeholder alignment on software development; established Scrum across all backend teams.</w:t>
+        <w:t>Built content operations, CMS workflows and partner onboarding; introduced Scrum and scaled music as a core mobile content category.</w:t>
       </w:r>
     </w:p>
     <w:p>
       <w:pPr>
         <w:pStyle w:val="ListBullet"/>
-        <w:spacing w:after="40"/>
-        <w:ind w:left="216"/>
       </w:pPr>
       <w:r>
-        <w:t>Incident management for content topics (formats, ingestion, licensing, etc.).</w:t>
+        <w:t>Owned roadmaps, KPI tracking and launch delivery across content ingestion, licensing, metadata and mobile product releases.</w:t>
       </w:r>
-    </w:p>
-    <w:p>
-      <w:pPr>
-        <w:pStyle w:val="ListBullet"/>
-        <w:spacing w:after="40"/>
-        <w:ind w:left="216"/>
-      </w:pPr>
-      <w:r>
-        <w:t>Developed, managed and optimised KPI measurement.</w:t>
-      </w:r>
-    </w:p>
-    <w:p>
-      <w:pPr>
-        <w:pStyle w:val="ListBullet"/>
-        <w:spacing w:after="40"/>
-        <w:ind w:left="216"/>
-      </w:pPr>
-      <w:r>
-        <w:t>Designed new landing pages for retention and acquisition.</w:t>
-      </w:r>
-    </w:p>
-    <w:p>
-      <w:pPr>
-        <w:spacing w:after="80"/>
-      </w:pPr>
-    </w:p>
-    <w:p>
-      <w:pPr>
-        <w:tabs>
-          <w:tab w:val="right" w:pos="9000"/>
-        </w:tabs>
-        <w:spacing w:before="40" w:after="0"/>
-      </w:pPr>
-      <w:r>
-        <w:t>Product Manager Content Services</w:t>
-        <w:tab/>
-        <w:t>2013 to 2014</w:t>
-      </w:r>
-    </w:p>
-    <w:p>
-      <w:pPr>
-        <w:pStyle w:val="ListBullet"/>
-        <w:spacing w:after="40"/>
-        <w:ind w:left="216"/>
-      </w:pPr>
-      <w:r>
-        <w:t>Delivered the roadmap for content services.</w:t>
-      </w:r>
-    </w:p>
-    <w:p>
-      <w:pPr>
-        <w:pStyle w:val="ListBullet"/>
-        <w:spacing w:after="40"/>
-        <w:ind w:left="216"/>
-      </w:pPr>
-      <w:r>
-        <w:t>Cross-functional project management.</w:t>
-      </w:r>
-    </w:p>
-    <w:p>
-      <w:pPr>
-        <w:pStyle w:val="ListBullet"/>
-        <w:spacing w:after="40"/>
-        <w:ind w:left="216"/>
-      </w:pPr>
-      <w:r>
-        <w:t>Revision of the legacy content management system.</w:t>
-      </w:r>
-    </w:p>
-    <w:p>
-      <w:pPr>
-        <w:pStyle w:val="ListBullet"/>
-        <w:spacing w:after="40"/>
-        <w:ind w:left="216"/>
-      </w:pPr>
-      <w:r>
-        <w:t>Incident management for content.</w:t>
-      </w:r>
-    </w:p>
-    <w:p>
-      <w:pPr>
-        <w:pStyle w:val="ListBullet"/>
-        <w:spacing w:after="40"/>
-        <w:ind w:left="216"/>
-      </w:pPr>
-      <w:r>
-        <w:t>Product owner role within the Scrum framework.</w:t>
-      </w:r>
-    </w:p>
-    <w:p>
-      <w:pPr>
-        <w:spacing w:after="80"/>
-      </w:pPr>
-    </w:p>
-    <w:p>
-      <w:pPr>
-        <w:tabs>
-          <w:tab w:val="right" w:pos="9000"/>
-        </w:tabs>
-        <w:spacing w:before="40" w:after="0"/>
-      </w:pPr>
-      <w:r>
-        <w:t>Technical Operations Manager &amp; Product Manager Music</w:t>
-        <w:tab/>
-        <w:t>2012 to 2013</w:t>
-      </w:r>
-    </w:p>
-    <w:p>
-      <w:pPr>
-        <w:pStyle w:val="ListBullet"/>
-        <w:spacing w:after="40"/>
-        <w:ind w:left="216"/>
-      </w:pPr>
-      <w:r>
-        <w:t>Established a productive Scrum environment (Scrum Master).</w:t>
-      </w:r>
-    </w:p>
-    <w:p>
-      <w:pPr>
-        <w:pStyle w:val="ListBullet"/>
-        <w:spacing w:after="40"/>
-        <w:ind w:left="216"/>
-      </w:pPr>
-      <w:r>
-        <w:t>Developed and implemented product launches.</w:t>
-      </w:r>
-    </w:p>
-    <w:p>
-      <w:pPr>
-        <w:pStyle w:val="ListBullet"/>
-        <w:spacing w:after="40"/>
-        <w:ind w:left="216"/>
-      </w:pPr>
-      <w:r>
-        <w:t>Integrated full-track music as a core content category.</w:t>
-      </w:r>
-    </w:p>
-    <w:p>
-      <w:pPr>
-        <w:pStyle w:val="ListBullet"/>
-        <w:spacing w:after="40"/>
-        <w:ind w:left="216"/>
-      </w:pPr>
-      <w:r>
-        <w:t>Automated ringtone upload into the content management system.</w:t>
-      </w:r>
-    </w:p>
-    <w:p>
-      <w:pPr>
-        <w:pStyle w:val="ListBullet"/>
-        <w:spacing w:after="40"/>
-        <w:ind w:left="216"/>
-      </w:pPr>
-      <w:r>
-        <w:t>Incident management for music and ringtones.</w:t>
-      </w:r>
-    </w:p>
-    <w:p>
-      <w:pPr>
-        <w:spacing w:after="80"/>
-      </w:pPr>
-    </w:p>
-    <w:p>
-      <w:pPr>
-        <w:tabs>
-          <w:tab w:val="right" w:pos="9000"/>
-        </w:tabs>
-        <w:spacing w:before="40" w:after="0"/>
-      </w:pPr>
-      <w:r>
-        <w:t>Technical Operations Manager &amp; Team Lead ,  Content Ingestion</w:t>
-        <w:tab/>
-        <w:t>2011 to 2012</w:t>
-      </w:r>
-    </w:p>
-    <w:p>
-      <w:pPr>
-        <w:pStyle w:val="ListBullet"/>
-        <w:spacing w:after="40"/>
-        <w:ind w:left="216"/>
-      </w:pPr>
-      <w:r>
-        <w:t>Technical support for international partners (labels, distributors, partners).</w:t>
-      </w:r>
-    </w:p>
-    <w:p>
-      <w:pPr>
-        <w:pStyle w:val="ListBullet"/>
-        <w:spacing w:after="40"/>
-        <w:ind w:left="216"/>
-      </w:pPr>
-      <w:r>
-        <w:t>KPI tracking.</w:t>
-      </w:r>
-    </w:p>
-    <w:p>
-      <w:pPr>
-        <w:pStyle w:val="ListBullet"/>
-        <w:spacing w:after="40"/>
-        <w:ind w:left="216"/>
-      </w:pPr>
-      <w:r>
-        <w:t>Automated ringtone production.</w:t>
-      </w:r>
-    </w:p>
-    <w:p>
-      <w:pPr>
-        <w:pStyle w:val="ListBullet"/>
-        <w:spacing w:after="40"/>
-        <w:ind w:left="216"/>
-      </w:pPr>
-      <w:r>
-        <w:t>Measured implementation and performance of existing and new features.</w:t>
-      </w:r>
-    </w:p>
-    <w:p>
-      <w:pPr>
-        <w:spacing w:after="80"/>
-      </w:pPr>
-    </w:p>
-    <w:p>
-      <w:pPr>
-        <w:tabs>
-          <w:tab w:val="right" w:pos="9000"/>
-        </w:tabs>
-        <w:spacing w:before="40" w:after="0"/>
-      </w:pPr>
-      <w:r>
-        <w:t>Team Lead Audio Production &amp; Content Ingestion</w:t>
-        <w:tab/>
-        <w:t>2010 to 2011</w:t>
-      </w:r>
-    </w:p>
-    <w:p>
-      <w:pPr>
-        <w:pStyle w:val="ListBullet"/>
-        <w:spacing w:after="40"/>
-        <w:ind w:left="216"/>
-      </w:pPr>
-      <w:r>
-        <w:t>Simplified the production process.</w:t>
-      </w:r>
-    </w:p>
-    <w:p>
-      <w:pPr>
-        <w:pStyle w:val="ListBullet"/>
-        <w:spacing w:after="40"/>
-        <w:ind w:left="216"/>
-      </w:pPr>
-      <w:r>
-        <w:t>Created new formats for mobile devices.</w:t>
-      </w:r>
-    </w:p>
-    <w:p>
-      <w:pPr>
-        <w:pStyle w:val="ListBullet"/>
-        <w:spacing w:after="40"/>
-        <w:ind w:left="216"/>
-      </w:pPr>
-      <w:r>
-        <w:t>Improved time-to-market for media content delivery.</w:t>
-      </w:r>
-    </w:p>
-    <w:p>
-      <w:pPr>
-        <w:pStyle w:val="ListBullet"/>
-        <w:spacing w:after="40"/>
-        <w:ind w:left="216"/>
-      </w:pPr>
-      <w:r>
-        <w:t>Competitive analysis and insights for senior management.</w:t>
-      </w:r>
-    </w:p>
-    <w:p>
-      <w:pPr>
-        <w:spacing w:after="80"/>
-      </w:pPr>
-    </w:p>
-    <w:p>
-      <w:pPr>
-        <w:tabs>
-          <w:tab w:val="right" w:pos="9000"/>
-        </w:tabs>
-        <w:spacing w:before="40" w:after="0"/>
-      </w:pPr>
-      <w:r>
-        <w:t>Team Lead Audio Production &amp; Content Upload</w:t>
-        <w:tab/>
-        <w:t>2008 to 2010</w:t>
-      </w:r>
-    </w:p>
-    <w:p>
-      <w:pPr>
-        <w:pStyle w:val="ListBullet"/>
-        <w:spacing w:after="40"/>
-        <w:ind w:left="216"/>
-      </w:pPr>
-      <w:r>
-        <w:t>Led the audio content production and upload team (7 people).</w:t>
-      </w:r>
-    </w:p>
-    <w:p>
-      <w:pPr>
-        <w:pStyle w:val="ListBullet"/>
-        <w:spacing w:after="40"/>
-        <w:ind w:left="216"/>
-      </w:pPr>
-      <w:r>
-        <w:t>Adjusted metadata and imported licence details.</w:t>
-      </w:r>
-    </w:p>
-    <w:p>
-      <w:pPr>
-        <w:pStyle w:val="ListBullet"/>
-        <w:spacing w:after="40"/>
-        <w:ind w:left="216"/>
-      </w:pPr>
-      <w:r>
-        <w:t>Technical contact for external partners.</w:t>
-      </w:r>
-    </w:p>
-    <w:p>
-      <w:pPr>
-        <w:pStyle w:val="ListBullet"/>
-        <w:spacing w:after="40"/>
-        <w:ind w:left="216"/>
-      </w:pPr>
-      <w:r>
-        <w:t>Audio production for TV spots.</w:t>
-      </w:r>
-    </w:p>
-    <w:p>
-      <w:pPr>
-        <w:spacing w:after="80"/>
-      </w:pPr>
     </w:p>
     <w:p>
       <w:pPr>
@@ -1127,55 +519,18 @@
       </w:r>
     </w:p>
     <w:p>
-      <w:pPr>
-        <w:pStyle w:val="ListBullet"/>
-      </w:pPr>
       <w:r>
-        <w:t xml:space="preserve">Ongoing music production; selected artists and projects include </w:t>
-      </w:r>
-      <w:hyperlink r:id="rId8">
-        <w:r>
-          <w:rPr>
-            <w:color w:val="0563C1"/>
-            <w:u w:val="single"/>
-          </w:rPr>
-          <w:t>Knaller Soundsystem</w:t>
-        </w:r>
-      </w:hyperlink>
-      <w:r>
-        <w:t xml:space="preserve">, </w:t>
-      </w:r>
-      <w:hyperlink r:id="rId9">
-        <w:r>
-          <w:rPr>
-            <w:color w:val="0563C1"/>
-            <w:u w:val="single"/>
-          </w:rPr>
-          <w:t>David Main</w:t>
-        </w:r>
-      </w:hyperlink>
-      <w:r>
-        <w:t>, Mic Profz, Lucry, PA Sports, among others.</w:t>
-      </w:r>
-    </w:p>
-    <w:p>
-      <w:r>
-        <w:t>Music production, Berlin</w:t>
+        <w:t>Music production &amp; independent label</w:t>
         <w:tab/>
         <w:t>2000 to present</w:t>
       </w:r>
     </w:p>
     <w:p>
       <w:pPr>
-        <w:tabs>
-          <w:tab w:val="right" w:pos="9000"/>
-        </w:tabs>
-        <w:spacing w:before="40" w:after="0"/>
+        <w:pStyle w:val="ListBullet"/>
       </w:pPr>
       <w:r>
-        <w:t>Universal Music, Berlin</w:t>
-        <w:tab/>
-        <w:t>2007 to 2008</w:t>
+        <w:t>Ongoing music production; selected projects with artists such as Knaller Soundsystem and David Main.</w:t>
       </w:r>
     </w:p>
     <w:p>
@@ -1183,20 +538,14 @@
         <w:pStyle w:val="ListBullet"/>
       </w:pPr>
       <w:r>
-        <w:t>Internship in product coordination / operations.</w:t>
+        <w:t>Co-founded and managed independent label 24-7 Records (2003 to 2005).</w:t>
       </w:r>
     </w:p>
     <w:p>
-      <w:pPr>
-        <w:tabs>
-          <w:tab w:val="right" w:pos="9000"/>
-        </w:tabs>
-        <w:spacing w:before="40" w:after="0"/>
-      </w:pPr>
       <w:r>
-        <w:t>Studio for Electroacoustic Music ,  Academy of Arts, Berlin</w:t>
+        <w:t>Internships and early industry roles</w:t>
         <w:tab/>
-        <w:t>2006</w:t>
+        <w:t>1999 to 2008</w:t>
       </w:r>
     </w:p>
     <w:p>
@@ -1204,20 +553,15 @@
         <w:pStyle w:val="ListBullet"/>
       </w:pPr>
       <w:r>
-        <w:t>Project work in marketing &amp; PR (Akademie der Künste).</w:t>
+        <w:t>Universal Music, Berlin — internship in product coordination / operations (2007 to 2008).</w:t>
       </w:r>
     </w:p>
     <w:p>
       <w:pPr>
-        <w:tabs>
-          <w:tab w:val="right" w:pos="9000"/>
-        </w:tabs>
-        <w:spacing w:before="40" w:after="0"/>
+        <w:pStyle w:val="ListBullet"/>
       </w:pPr>
       <w:r>
-        <w:t>Short film "Wasser &amp; Papayas" ,  sound engineer</w:t>
-        <w:tab/>
-        <w:t>2006</w:t>
+        <w:t>Project work in marketing &amp; PR at Akademie der Künste, Studio for Electroacoustic Music, Berlin (2006).</w:t>
       </w:r>
     </w:p>
     <w:p>
@@ -1225,20 +569,15 @@
         <w:pStyle w:val="ListBullet"/>
       </w:pPr>
       <w:r>
-        <w:t>Sound recording / engineering for short film.</w:t>
+        <w:t>Sound recording / engineering for short film "Wasser &amp; Papayas" (2006).</w:t>
       </w:r>
     </w:p>
     <w:p>
       <w:pPr>
-        <w:tabs>
-          <w:tab w:val="right" w:pos="9000"/>
-        </w:tabs>
-        <w:spacing w:before="40" w:after="0"/>
+        <w:pStyle w:val="ListBullet"/>
       </w:pPr>
       <w:r>
-        <w:t>24-7 Records Germany ,  Co-founder</w:t>
-        <w:tab/>
-        <w:t>2003 to 2005</w:t>
+        <w:t>Project work in marketing &amp; PR at Rianoni Music, Berlin (2005).</w:t>
       </w:r>
     </w:p>
     <w:p>
@@ -1246,81 +585,16 @@
         <w:pStyle w:val="ListBullet"/>
       </w:pPr>
       <w:r>
-        <w:t>Co-founded and managed independent label 24-7 Records.</w:t>
+        <w:t>Moneypenny, Paris — music production internship (2002).</w:t>
       </w:r>
     </w:p>
     <w:p>
       <w:pPr>
-        <w:tabs>
-          <w:tab w:val="right" w:pos="9000"/>
-        </w:tabs>
-        <w:spacing w:before="40" w:after="0"/>
-        <w:rPr>
-          <w:i/>
-          <w:color w:val="5F5A52"/>
-          <w:sz w:val="18"/>
-        </w:rPr>
+        <w:pStyle w:val="ListBullet"/>
       </w:pPr>
       <w:r>
-        <w:t>Rianoni Music, Berlin</w:t>
-        <w:tab/>
-        <w:t>2005</w:t>
+        <w:t>DResearch Digital Media Systems GmbH — assistant on projects and administration (1999 to 2001).</w:t>
       </w:r>
-    </w:p>
-    <w:p>
-      <w:pPr>
-        <w:pStyle w:val="ListBullet"/>
-      </w:pPr>
-      <w:r>
-        <w:t>Project work in marketing &amp; PR (Rianoni Music).</w:t>
-      </w:r>
-    </w:p>
-    <w:p>
-      <w:pPr>
-        <w:tabs>
-          <w:tab w:val="right" w:pos="9000"/>
-        </w:tabs>
-        <w:spacing w:before="40" w:after="0"/>
-      </w:pPr>
-      <w:r>
-        <w:t>Moneypenny, Paris</w:t>
-        <w:tab/>
-        <w:t>2002</w:t>
-      </w:r>
-    </w:p>
-    <w:p>
-      <w:pPr>
-        <w:pStyle w:val="ListBullet"/>
-      </w:pPr>
-      <w:r>
-        <w:t>Music production (internship).</w:t>
-      </w:r>
-    </w:p>
-    <w:p>
-      <w:pPr>
-        <w:tabs>
-          <w:tab w:val="right" w:pos="9000"/>
-        </w:tabs>
-        <w:spacing w:before="40" w:after="0"/>
-      </w:pPr>
-      <w:r>
-        <w:t>DResearch Digital Media Systems GmbH ,  assistant</w:t>
-        <w:tab/>
-        <w:t>1999 to 2001</w:t>
-      </w:r>
-    </w:p>
-    <w:p>
-      <w:pPr>
-        <w:pStyle w:val="ListBullet"/>
-      </w:pPr>
-      <w:r>
-        <w:t>Assistant on projects and administration.</w:t>
-      </w:r>
-    </w:p>
-    <w:p>
-      <w:pPr>
-        <w:spacing w:after="80"/>
-      </w:pPr>
     </w:p>
     <w:p>
       <w:pPr>
@@ -1442,29 +716,6 @@
       <w:pPr>
         <w:spacing w:after="80"/>
       </w:pPr>
-    </w:p>
-    <w:p>
-      <w:pPr>
-        <w:tabs>
-          <w:tab w:val="right" w:pos="9000"/>
-        </w:tabs>
-        <w:spacing w:before="40" w:after="0"/>
-      </w:pPr>
-      <w:r>
-        <w:t>Abitur (university entrance diploma) ,  4. Gymnasium Descartes, Berlin</w:t>
-        <w:tab/>
-        <w:t>1994 to 2001</w:t>
-      </w:r>
-    </w:p>
-    <w:p>
-      <w:pPr>
-        <w:pStyle w:val="ListBullet"/>
-        <w:spacing w:after="40"/>
-        <w:ind w:left="216"/>
-      </w:pPr>
-      <w:r>
-        <w:t>German university entrance qualification (Abitur).</w:t>
-      </w:r>
     </w:p>
     <w:p>
       <w:pPr>

</xml_diff>

<commit_message>
chore: remove Russian from languages section
Co-authored-by: Cursor <cursoragent@cursor.com>
</commit_message>
<xml_diff>
--- a/src/David_Zaddach_CV_EN_2026.docx
+++ b/src/David_Zaddach_CV_EN_2026.docx
@@ -814,16 +814,6 @@
       </w:pPr>
       <w:r>
         <w:t>French: basic</w:t>
-      </w:r>
-    </w:p>
-    <w:p>
-      <w:pPr>
-        <w:pStyle w:val="ListBullet"/>
-        <w:spacing w:after="40"/>
-        <w:ind w:left="216"/>
-      </w:pPr>
-      <w:r>
-        <w:t>Russian: basic</w:t>
       </w:r>
     </w:p>
     <w:p>

</xml_diff>

<commit_message>
feat: update web and ATS PDF exports for Netlify deploy
Refresh web PDF layout (3 pages, print fixes), sync ATS/DOCX heading colors, remove scrum trainings cert, and bump download cache version.

Co-authored-by: Cursor <cursoragent@cursor.com>
</commit_message>
<xml_diff>
--- a/src/David_Zaddach_CV_EN_2026.docx
+++ b/src/David_Zaddach_CV_EN_2026.docx
@@ -87,7 +87,6 @@
         <w:rPr>
           <w:b/>
           <w:color w:val="5F5226"/>
-          <w:sz w:val="24"/>
         </w:rPr>
         <w:t>Profile</w:t>
       </w:r>
@@ -113,18 +112,8 @@
         <w:rPr>
           <w:b/>
           <w:color w:val="5F5226"/>
-          <w:sz w:val="24"/>
         </w:rPr>
-        <w:t>Ski</w:t>
-      </w:r>
-      <w:proofErr w:type="spellEnd"/>
-      <w:r>
-        <w:rPr>
-          <w:b/>
-          <w:color w:val="5F5226"/>
-          <w:sz w:val="24"/>
-        </w:rPr>
-        <w:t>lls &amp; knowledge</w:t>
+        <w:t>Skills &amp; knowledge</w:t>
       </w:r>
     </w:p>
     <w:p>
@@ -215,7 +204,6 @@
         <w:rPr>
           <w:b/>
           <w:color w:val="5F5226"/>
-          <w:sz w:val="24"/>
         </w:rPr>
         <w:t>Professional experience</w:t>
       </w:r>
@@ -297,6 +285,7 @@
     </w:p>
     <w:p>
       <w:pPr>
+        <w:pageBreakBefore/>
         <w:tabs>
           <w:tab w:val="right" w:pos="9000"/>
         </w:tabs>
@@ -512,8 +501,7 @@
       <w:r>
         <w:rPr>
           <w:b/>
-          <w:color w:val="303030"/>
-          <w:sz w:val="21"/>
+          <w:color w:val="5F5226"/>
         </w:rPr>
         <w:t>Further experience</w:t>
       </w:r>
@@ -542,6 +530,9 @@
       </w:r>
     </w:p>
     <w:p>
+      <w:pPr>
+        <w:pageBreakBefore/>
+      </w:pPr>
       <w:r>
         <w:t>Internships and early industry roles</w:t>
         <w:tab/>
@@ -604,7 +595,6 @@
         <w:rPr>
           <w:b/>
           <w:color w:val="5F5226"/>
-          <w:sz w:val="24"/>
         </w:rPr>
         <w:t>Education</w:t>
       </w:r>
@@ -730,7 +720,6 @@
         <w:rPr>
           <w:b/>
           <w:color w:val="5F5226"/>
-          <w:sz w:val="24"/>
         </w:rPr>
         <w:t>Certifications (selection)</w:t>
       </w:r>
@@ -760,16 +749,6 @@
     </w:p>
     <w:p>
       <w:pPr>
-        <w:pStyle w:val="ListBullet"/>
-        <w:spacing w:after="40"/>
-        <w:ind w:left="216"/>
-      </w:pPr>
-      <w:r>
-        <w:t>Various Product Management and scrum trainings</w:t>
-      </w:r>
-    </w:p>
-    <w:p>
-      <w:pPr>
         <w:spacing w:after="80"/>
       </w:pPr>
     </w:p>
@@ -781,7 +760,6 @@
         <w:rPr>
           <w:b/>
           <w:color w:val="5F5226"/>
-          <w:sz w:val="24"/>
         </w:rPr>
         <w:t>Languages</w:t>
       </w:r>

</xml_diff>